<commit_message>
docs: adiciona figuras e perfis ao resumo expandido da Atvd 7
</commit_message>
<xml_diff>
--- a/docs/artigos/ResumoExpandido/ResumoExpandido_VictorHugoGerotoToledo_IIICongressoUniSENAI.docx
+++ b/docs/artigos/ResumoExpandido/ResumoExpandido_VictorHugoGerotoToledo_IIICongressoUniSENAI.docx
@@ -504,7 +504,7 @@
           <w:szCs w:val="24"/>
           <w:lang w:val="pt-BR" w:eastAsia="pt-BR"/>
         </w:rPr>
-        <w:t>A rápida transformação digital dos últimos anos tem gerado uma demanda crescente em relação à infraestrutura e à arquitetura dos sistemas de software. As aplicações modernas devem lidar com um grande número de solicitações simultâneas, ajustar-se rapidamente a novas demandas de negócios e assegurar disponibilidade constante em ambientes dinâmicos. De acordo com Bass, Clements e Kazman (2012), a arquitetura de software é o conjunto de estruturas necessárias para raciocinar sobre o sistema, compreendendo elementos de software, relações entre eles e propriedades de ambos. Nesse cenário, a escolha do padrão arquitetural correto constitui uma decisão estratégica que afeta diretamente a evolução, a manutenção e a escalabilidade do sistema durante todo o seu ciclo de vida (GARLAN; SHAW, 1993).</w:t>
+        <w:t xml:space="preserve">A transformação digital dos últimos anos ampliou a demanda sobre a infraestrutura e a arquitetura dos sistemas de software, que devem sustentar grande volume de solicitações simultâneas e disponibilidade constante em ambientes dinâmicos. Segundo Bass, Clements e Kazman (2012), a arquitetura de software é o conjunto de estruturas necessárias para raciocinar sobre o sistema, compreendendo seus elementos, as relações entre eles e as propriedades de ambos. A escolha do padrão arquitetural é, nesse cenário, decisão estratégica que afeta a evolução, a manutenção e a escalabilidade do sistema ao longo de todo o seu ciclo de vida (GARLAN; SHAW, 1993).</w:t>
       </w:r>
     </w:p>
     <w:p>
@@ -606,7 +606,7 @@
           <w:szCs w:val="24"/>
           <w:lang w:val="pt-BR" w:eastAsia="pt-BR"/>
         </w:rPr>
-        <w:t>A literatura indica que arquiteturas monolíticas, em camadas e baseadas em Clean Architecture apresentam vantagens e desvantagens específicas para diferentes contextos. Blinowski, Ojdowska e Przybylek (2022) demonstraram que, em uma máquina única, o monólito supera os microsserviços em termos de latência — um resultado contraintuitivo que reforça a necessidade de investigação empírica rigorosa. Contudo, poucos estudos realizaram comparações controladas e quantitativas entre os três modelos nas mesmas condições operacionais, o que deixa lacunas científicas significativas para a tomada de decisões no desenvolvimento profissional.</w:t>
+        <w:t xml:space="preserve">A literatura indica vantagens e desvantagens específicas de cada padrão conforme o contexto. Blinowski, Ojdowska e Przybylek (2022) demonstraram que, em máquina única, o monólito supera os microsserviços em latência — resultado contraintuitivo que reforça a necessidade de investigação empírica rigorosa. Poucos estudos, contudo, compararam os três modelos sob as mesmas condições operacionais, o que deixa lacunas significativas para a tomada de decisão no desenvolvimento profissional.</w:t>
       </w:r>
     </w:p>
     <w:p>
@@ -694,7 +694,7 @@
           <w:szCs w:val="24"/>
           <w:lang w:val="pt-BR" w:eastAsia="pt-BR"/>
         </w:rPr>
-        <w:t xml:space="preserve">Os impactos da lacuna identificada são expressivos. Empresas que adotam padrões </w:t>
+        <w:t xml:space="preserve">Os impactos da lacuna são expressivos: padrões inadequados produzem dívida técnica acumulada, custos crescentes de manutenção e dificuldade de escalonamento conforme a base de usuários cresce. Newman (2015) observa que a separação difusa de responsabilidades em sistemas monolíticos transforma aplicações inicialmente simples em estruturas de difícil compreensão e evolução. A literatura disponível compara majoritariamente monólitos e microsserviços, sem considerar a Clean Architecture como alternativa estruturalmente coesa (RICHARDS, 2015).</w:t>
       </w:r>
       <w:r>
         <w:rPr>
@@ -706,7 +706,7 @@
           <w:lang w:val="pt-BR" w:eastAsia="pt-BR"/>
         </w:rPr>
         <w:lastRenderedPageBreak/>
-        <w:t>inadequados enfrentam dívida tecnológica acumulada, aumento exponencial nos custos de manutenção e dificuldade de escalonamento conforme a base de usuários cresce. Newman (2015) observa que a falta de clareza na separação de responsabilidades em sistemas monolíticos pode transformar aplicações inicialmente simples em estruturas de difícil compreensão e evolução. A maioria das pesquisas disponíveis compara apenas dois modelos, geralmente monólitos e microsserviços, sem considerar a Clean Architecture como alternativa estruturalmente coesa (RICHARDS, 2015). Este trabalho busca preencher essa lacuna por meio da criação de um protótipo tripartido — a mesma aplicação desenvolvida três vezes —, possibilitando a coleta de métricas objetivas em um ambiente controlado e reproduzível, com o objetivo de propor diretrizes baseadas em evidências para a seleção de padrões arquiteturais.</w:t>
+        <w:t xml:space="preserve"/>
       </w:r>
     </w:p>
     <w:p>
@@ -812,7 +812,7 @@
           <w:szCs w:val="24"/>
           <w:lang w:val="pt-BR" w:eastAsia="pt-BR"/>
         </w:rPr>
-        <w:t>A comparação empírica entre padrões arquiteturais constitui uma linha de investigação estabelecida na Engenharia de Software, embora concentrada em um recorte específico. A revisão da literatura correlata a esta pesquisa revela que a quase totalidade dos estudos comparativos disponíveis opõe arquiteturas monolíticas a arquiteturas baseadas em microsserviços, tratando os padrões intermediários de organização interna do código — como a Arquitetura em Camadas e a Clean Architecture — como boas práticas de estruturação de monólitos, e não como objetos de avaliação empírica em igualdade de condições.</w:t>
+        <w:t xml:space="preserve">A comparação empírica entre padrões arquiteturais constitui linha de investigação estabelecida na Engenharia de Software, mas concentrada em um recorte específico: quase todos os estudos disponíveis opõem monólitos a microsserviços, tratando a Arquitetura em Camadas e a Clean Architecture como boas práticas de estruturação interna, e não como objetos de avaliação empírica em igualdade de condições.</w:t>
       </w:r>
     </w:p>
     <w:p>
@@ -896,7 +896,7 @@
           <w:szCs w:val="24"/>
           <w:lang w:val="pt-BR" w:eastAsia="pt-BR"/>
         </w:rPr>
-        <w:t>Contribuições mais recentes reforçam essa leitura e permitem delimitar a lacuna com precisão. Velepucha e Flores (2023) sistematizaram, também na IEEE Access, os princípios, padrões e desafios de migração associados à arquitetura de microsserviços. Abgaz et al. (2023) examinaram trinta e cinco trabalhos primários sob protocolo de revisão sistemática e concluíram que a decomposição de monólitos em microsserviços permanece em estágio inicial de maturidade. Nenhum dos estudos identificados, contudo, avalia empiricamente a Clean Architecture como alternativa estruturalmente coesa em comparação controlada com o monólito e com a Arquitetura em Camadas, sob identidade funcional, de linguagem e de infraestrutura. É nessa lacuna que se insere a contribuição deste trabalho.</w:t>
+        <w:t xml:space="preserve">Velepucha e Flores (2023) sistematizaram, também na IEEE Access, os princípios e desafios de migração associados aos microsserviços, e Abgaz et al. (2023) examinaram trinta e cinco trabalhos primários sob revisão sistemática, concluindo que a decomposição de monólitos permanece em estágio inicial de maturidade. Nenhum dos estudos identificados, contudo, avalia empiricamente a Clean Architecture em comparação controlada com o monólito e com a Arquitetura em Camadas, sob identidade funcional, de linguagem e de infraestrutura — lacuna em que se insere a contribuição deste trabalho.</w:t>
       </w:r>
     </w:p>
     <w:p>
@@ -990,7 +990,100 @@
           <w:szCs w:val="24"/>
           <w:lang w:val="pt-BR" w:eastAsia="pt-BR"/>
         </w:rPr>
-        <w:t>Cada instância do protótipo é implantada em contêineres Docker executados em instâncias Amazon EC2 de configuração idêntica, orquestrados pelo Amazon Elastic Container Service (ECS), garantindo condições homogêneas para a coleta de métricas comparativas. O armazenamento de dados é realizado por meio do Amazon RDS com motor PostgreSQL, seguindo os princípios do AWS Well-Architected Framework (AWS, 2023). Para a coleta de métricas de desempenho — tempo de resposta, throughput e consumo de memória — é utilizado o Apache JMeter na geração de carga controlada, com monitoramento centralizado por meio do Amazon CloudWatch e visualização dos indicadores em dashboards construídos no Grafana, permitindo a comparação direta dos resultados entre as três versões da aplicação.</w:t>
+        <w:t>Cada instância do protótipo é implantada em contêineres Docker executados em instâncias Amazon EC2 de configuração idêntica, orquestrados pelo Amazon Elastic Container Service (ECS), garantindo condições homogêneas para a coleta de métricas comparativas. O armazenamento de dados é realizado por meio do Amazon RDS com motor PostgreSQL, seguindo os princípios do AWS Well-Architected Framework (AWS, 2023). Para a coleta de métricas de desempenho — tempo de resposta, throughput e consumo de memória — é utilizado o Apache JMeter na geração de carga controlada, com monitoramento centralizado por meio do Amazon CloudWatch e visualização dos indicadores em dashboards construídos no Grafana, permitindo a comparação direta dos resultados entre as três versões da aplicação, conforme ilustra a Figura 1.</w:t>
+      </w:r>
+    </w:p>
+    <w:p>
+      <w:pPr>
+        <w:jc w:val="center"/>
+        <w:rPr>
+          <w:rFonts w:ascii="Arial" w:hAnsi="Arial" w:cs="Arial"/>
+          <w:b/>
+          <w:sz w:val="20"/>
+          <w:szCs w:val="20"/>
+          <w:lang w:val="pt-BR"/>
+        </w:rPr>
+      </w:pPr>
+      <w:r>
+        <w:rPr>
+          <w:rFonts w:ascii="Arial" w:hAnsi="Arial" w:cs="Arial"/>
+          <w:b/>
+          <w:sz w:val="20"/>
+          <w:szCs w:val="20"/>
+          <w:lang w:val="pt-BR"/>
+        </w:rPr>
+        <w:t xml:space="preserve">Figura 1 — Arquitetura da solução e instrumentação da coleta de métricas</w:t>
+      </w:r>
+    </w:p>
+    <w:p>
+      <w:pPr>
+        <w:jc w:val="center"/>
+        <w:rPr>
+          <w:rFonts w:ascii="Arial" w:hAnsi="Arial" w:cs="Arial"/>
+          <w:sz w:val="20"/>
+          <w:szCs w:val="20"/>
+          <w:lang w:val="pt-BR"/>
+        </w:rPr>
+      </w:pPr>
+      <w:r>
+        <w:rPr>
+          <w:noProof/>
+        </w:rPr>
+        <w:drawing>
+          <wp:inline distT="0" distB="0" distL="0" distR="0">
+            <wp:extent cx="3600000" cy="865726"/>
+            <wp:effectExtent l="0" t="0" r="0" b="0"/>
+            <wp:docPr id="1001" name="Figura 1"/>
+            <wp:cNvGraphicFramePr>
+              <a:graphicFrameLocks xmlns:a="http://schemas.openxmlformats.org/drawingml/2006/main" noChangeAspect="1"/>
+            </wp:cNvGraphicFramePr>
+            <a:graphic xmlns:a="http://schemas.openxmlformats.org/drawingml/2006/main">
+              <a:graphicData uri="http://schemas.openxmlformats.org/drawingml/2006/picture">
+                <pic:pic xmlns:pic="http://schemas.openxmlformats.org/drawingml/2006/picture">
+                  <pic:nvPicPr>
+                    <pic:cNvPr id="0" name="Figura 1"/>
+                    <pic:cNvPicPr/>
+                  </pic:nvPicPr>
+                  <pic:blipFill>
+                    <a:blip r:embed="rId12"/>
+                    <a:stretch>
+                      <a:fillRect/>
+                    </a:stretch>
+                  </pic:blipFill>
+                  <pic:spPr>
+                    <a:xfrm>
+                      <a:off x="0" y="0"/>
+                      <a:ext cx="3600000" cy="865726"/>
+                    </a:xfrm>
+                    <a:prstGeom prst="rect">
+                      <a:avLst/>
+                    </a:prstGeom>
+                  </pic:spPr>
+                </pic:pic>
+              </a:graphicData>
+            </a:graphic>
+          </wp:inline>
+        </w:drawing>
+      </w:r>
+    </w:p>
+    <w:p>
+      <w:pPr>
+        <w:jc w:val="center"/>
+        <w:rPr>
+          <w:rFonts w:ascii="Arial" w:hAnsi="Arial" w:cs="Arial"/>
+          <w:sz w:val="20"/>
+          <w:szCs w:val="20"/>
+          <w:lang w:val="pt-BR"/>
+        </w:rPr>
+      </w:pPr>
+      <w:r>
+        <w:rPr>
+          <w:rFonts w:ascii="Arial" w:hAnsi="Arial" w:cs="Arial"/>
+          <w:sz w:val="20"/>
+          <w:szCs w:val="20"/>
+          <w:lang w:val="pt-BR"/>
+        </w:rPr>
+        <w:t xml:space="preserve">Fonte: elaborado pelo autor (2026).</w:t>
       </w:r>
     </w:p>
     <w:p>
@@ -1096,7 +1189,100 @@
           <w:szCs w:val="24"/>
           <w:lang w:val="pt-BR" w:eastAsia="pt-BR"/>
         </w:rPr>
-        <w:t>Com base na fundamentação teórica revisada, formulou-se a hipótese central que orientará a análise dos dados nas próximas etapas da pesquisa: espera-se que a Clean Architecture proporcione melhores métricas de testabilidade e menor acoplamento entre módulos; que o Monólito apresente menor latência em cenários de baixa carga, replicando o resultado contraintuitivo relatado por Blinowski, Ojdowska e Przybylek (2022); e que a Arquitetura em Camadas ofereça o melhor equilíbrio entre simplicidade e organização estrutural para equipes menores. Essas expectativas serão confrontadas com os dados objetivos de desempenho, qualidade de código e manutenibilidade coletados na fase experimental subsequente, sob condições controladas que eliminam variáveis externas como divergências de domínio de negócio, linguagem de programação ou capacidade de hardware.</w:t>
+        <w:t>Com base na fundamentação teórica revisada, formulou-se a hipótese central que orientará a análise dos dados nas próximas etapas da pesquisa: espera-se que a Clean Architecture proporcione melhores métricas de testabilidade e menor acoplamento entre módulos; que o Monólito apresente menor latência em cenários de baixa carga, replicando o resultado contraintuitivo relatado por Blinowski, Ojdowska e Przybylek (2022); e que a Arquitetura em Camadas ofereça o melhor equilíbrio entre simplicidade e organização estrutural para equipes menores. Essas expectativas serão confrontadas com os dados objetivos de desempenho, qualidade de código e manutenibilidade coletados na fase experimental subsequente, sob condições controladas que eliminam variáveis externas como divergências de domínio de negócio, linguagem de programação ou capacidade de hardware, conforme sintetiza a Figura 2.</w:t>
+      </w:r>
+    </w:p>
+    <w:p>
+      <w:pPr>
+        <w:jc w:val="center"/>
+        <w:rPr>
+          <w:rFonts w:ascii="Arial" w:hAnsi="Arial" w:cs="Arial"/>
+          <w:b/>
+          <w:sz w:val="20"/>
+          <w:szCs w:val="20"/>
+          <w:lang w:val="pt-BR"/>
+        </w:rPr>
+      </w:pPr>
+      <w:r>
+        <w:rPr>
+          <w:rFonts w:ascii="Arial" w:hAnsi="Arial" w:cs="Arial"/>
+          <w:b/>
+          <w:sz w:val="20"/>
+          <w:szCs w:val="20"/>
+          <w:lang w:val="pt-BR"/>
+        </w:rPr>
+        <w:t xml:space="preserve">Figura 2 — Hipóteses de comportamento relativo entre os padrões avaliados</w:t>
+      </w:r>
+    </w:p>
+    <w:p>
+      <w:pPr>
+        <w:jc w:val="center"/>
+        <w:rPr>
+          <w:rFonts w:ascii="Arial" w:hAnsi="Arial" w:cs="Arial"/>
+          <w:sz w:val="20"/>
+          <w:szCs w:val="20"/>
+          <w:lang w:val="pt-BR"/>
+        </w:rPr>
+      </w:pPr>
+      <w:r>
+        <w:rPr>
+          <w:noProof/>
+        </w:rPr>
+        <w:drawing>
+          <wp:inline distT="0" distB="0" distL="0" distR="0">
+            <wp:extent cx="2880000" cy="1389176"/>
+            <wp:effectExtent l="0" t="0" r="0" b="0"/>
+            <wp:docPr id="1004" name="Figura 2"/>
+            <wp:cNvGraphicFramePr>
+              <a:graphicFrameLocks xmlns:a="http://schemas.openxmlformats.org/drawingml/2006/main" noChangeAspect="1"/>
+            </wp:cNvGraphicFramePr>
+            <a:graphic xmlns:a="http://schemas.openxmlformats.org/drawingml/2006/main">
+              <a:graphicData uri="http://schemas.openxmlformats.org/drawingml/2006/picture">
+                <pic:pic xmlns:pic="http://schemas.openxmlformats.org/drawingml/2006/picture">
+                  <pic:nvPicPr>
+                    <pic:cNvPr id="0" name="Figura 2"/>
+                    <pic:cNvPicPr/>
+                  </pic:nvPicPr>
+                  <pic:blipFill>
+                    <a:blip r:embed="rId15"/>
+                    <a:stretch>
+                      <a:fillRect/>
+                    </a:stretch>
+                  </pic:blipFill>
+                  <pic:spPr>
+                    <a:xfrm>
+                      <a:off x="0" y="0"/>
+                      <a:ext cx="2880000" cy="1389176"/>
+                    </a:xfrm>
+                    <a:prstGeom prst="rect">
+                      <a:avLst/>
+                    </a:prstGeom>
+                  </pic:spPr>
+                </pic:pic>
+              </a:graphicData>
+            </a:graphic>
+          </wp:inline>
+        </w:drawing>
+      </w:r>
+    </w:p>
+    <w:p>
+      <w:pPr>
+        <w:jc w:val="center"/>
+        <w:rPr>
+          <w:rFonts w:ascii="Arial" w:hAnsi="Arial" w:cs="Arial"/>
+          <w:sz w:val="20"/>
+          <w:szCs w:val="20"/>
+          <w:lang w:val="pt-BR"/>
+        </w:rPr>
+      </w:pPr>
+      <w:r>
+        <w:rPr>
+          <w:rFonts w:ascii="Arial" w:hAnsi="Arial" w:cs="Arial"/>
+          <w:sz w:val="20"/>
+          <w:szCs w:val="20"/>
+          <w:lang w:val="pt-BR"/>
+        </w:rPr>
+        <w:t xml:space="preserve">Fonte: elaborado pelo autor (2026), a partir da literatura revisada.</w:t>
       </w:r>
     </w:p>
     <w:p>
@@ -1162,7 +1348,7 @@
           <w:szCs w:val="24"/>
           <w:lang w:val="pt-BR" w:eastAsia="pt-BR"/>
         </w:rPr>
-        <w:t>Este trabalho apresentou uma proposta de estudo comparativo, em desenvolvimento, entre três padrões arquiteturais amplamente utilizados no desenvolvimento de sistemas de software — Monólito, Arquitetura em Camadas (MVC) e Clean Architecture —, com o objetivo de fornecer diretrizes baseadas em evidências empíricas para a seleção do padrão mais adequado conforme o perfil e o contexto organizacional de cada projeto. A investigação fundamentou-se em literatura científica consolidada, incluindo os trabalhos de Martin (2017), Blinowski, Ojdowska e Przybylek (2022), Garlan e Shaw (1993), entre outros, demonstrando o alinhamento entre a proposta desenvolvida e as questões centrais da Engenharia de Software contemporânea.</w:t>
+        <w:t xml:space="preserve">Este trabalho apresentou uma proposta de estudo comparativo, em desenvolvimento, entre Monólito, Arquitetura em Camadas (MVC) e Clean Architecture, com o objetivo de fornecer diretrizes baseadas em evidências empíricas para a seleção do padrão mais adequado ao perfil e ao contexto organizacional de cada projeto, fundamentada em literatura consolidada — Martin (2017), Blinowski, Ojdowska e Przybylek (2022) e Garlan e Shaw (1993), entre outros.</w:t>
       </w:r>
     </w:p>
     <w:p>
@@ -1186,7 +1372,7 @@
           <w:szCs w:val="24"/>
           <w:lang w:val="pt-BR" w:eastAsia="pt-BR"/>
         </w:rPr>
-        <w:t>A arquitetura proposta — um protótipo tripartido hospedado na infraestrutura da AWS — possibilitará a coleta de métricas objetivas de desempenho, qualidade de código e manutenibilidade sob condições controladas, eliminando variáveis externas que comprometem a validade de comparações convencionais. As conclusões definitivas dependem da conclusão da implementação das três versões do protótipo e da execução dos testes de carga com o Apache JMeter, etapas previstas para as próximas fases da pesquisa. Como trabalhos futuros, propõe-se ainda a implementação de pipelines de integração e entrega contínua (CI/CD) para cada versão do protótipo e a investigação da viabilidade de decomposição da versão Clean Architecture em microsserviços.</w:t>
+        <w:t xml:space="preserve">O protótipo tripartido hospedado na infraestrutura da AWS possibilitará a coleta de métricas objetivas de desempenho, qualidade de código e manutenibilidade sob condições controladas, eliminando variáveis externas que comprometem a validade de comparações convencionais. As conclusões definitivas dependem da implementação das três versões e da execução dos testes de carga com o Apache JMeter. Como trabalhos futuros, propõem-se pipelines de integração e entrega contínua (CI/CD) para cada versão e a investigação da viabilidade de decomposição da versão Clean Architecture em microsserviços.</w:t>
       </w:r>
     </w:p>
     <w:p>
@@ -1537,7 +1723,7 @@
           <w:szCs w:val="24"/>
           <w:lang w:val="pt-BR" w:eastAsia="pt-BR"/>
         </w:rPr>
-        <w:t>Agradeço primeiramente a Deus por me conceder força e determinação ao longo desta jornada acadêmica. À minha família, pelo apoio incondicional e pela compreensão nos momentos de dedicação aos estudos. Aos professores orientadores Deivison Takatu e Glauco Todesco, pela orientação, paciência e contribuições fundamentais para o desenvolvimento deste trabalho. Por fim, ao SENAI, pela infraestrutura e pelo ensino de excelência que tornaram possível a realização desta pesquisa.</w:t>
+        <w:t>Agradeço primeiramente a Deus por me conceder força e determinação ao longo desta jornada acadêmica. À minha família, pelo apoio incondicional e pela compreensão nos momentos de dedicação aos estudos. Aos orientadores, Prof. Deivison Shindi Takatu e Prof. Glauco Todesco, pela orientação, paciência e contribuições fundamentais para o desenvolvimento deste trabalho. Por fim, ao SENAI, pela infraestrutura e pelo ensino de excelência que tornaram possível a realização desta pesquisa.</w:t>
       </w:r>
     </w:p>
     <w:p>
@@ -1583,70 +1769,6 @@
     </w:p>
     <w:p>
       <w:pPr>
-        <w:rPr>
-          <w:rFonts w:ascii="Arial" w:eastAsia="Meiryo" w:hAnsi="Arial" w:cs="Arial"/>
-          <w:b/>
-          <w:sz w:val="24"/>
-          <w:szCs w:val="24"/>
-          <w:lang w:val="pt-BR"/>
-        </w:rPr>
-      </w:pPr>
-      <w:r>
-        <w:rPr>
-          <w:rFonts w:ascii="Arial" w:eastAsia="Meiryo" w:hAnsi="Arial" w:cs="Arial"/>
-          <w:b/>
-          <w:sz w:val="24"/>
-          <w:szCs w:val="24"/>
-          <w:lang w:val="pt-BR"/>
-        </w:rPr>
-        <w:t>Sobre os autores:</w:t>
-      </w:r>
-    </w:p>
-    <w:p>
-      <w:pPr>
-        <w:rPr>
-          <w:rFonts w:ascii="Arial" w:eastAsia="Meiryo" w:hAnsi="Arial" w:cs="Arial"/>
-          <w:b/>
-          <w:sz w:val="24"/>
-          <w:szCs w:val="24"/>
-          <w:lang w:val="pt-BR"/>
-        </w:rPr>
-      </w:pPr>
-      <w:r>
-        <w:rPr>
-          <w:rFonts w:ascii="Arial" w:eastAsia="Meiryo" w:hAnsi="Arial" w:cs="Arial"/>
-          <w:b/>
-          <w:sz w:val="24"/>
-          <w:szCs w:val="24"/>
-          <w:lang w:val="pt-BR"/>
-        </w:rPr>
-        <w:t>_________________</w:t>
-      </w:r>
-    </w:p>
-    <w:p>
-      <w:pPr>
-        <w:rPr>
-          <w:rFonts w:ascii="Arial" w:eastAsia="Meiryo" w:hAnsi="Arial" w:cs="Arial"/>
-          <w:b/>
-          <w:sz w:val="24"/>
-          <w:szCs w:val="24"/>
-          <w:lang w:val="pt-BR"/>
-        </w:rPr>
-      </w:pPr>
-    </w:p>
-    <w:p>
-      <w:pPr>
-        <w:rPr>
-          <w:rFonts w:ascii="Arial" w:eastAsia="Meiryo" w:hAnsi="Arial" w:cs="Arial"/>
-          <w:b/>
-          <w:sz w:val="24"/>
-          <w:szCs w:val="24"/>
-          <w:lang w:val="pt-BR"/>
-        </w:rPr>
-      </w:pPr>
-    </w:p>
-    <w:p>
-      <w:pPr>
         <w:pStyle w:val="Textodenotadefim"/>
         <w:rPr>
           <w:rFonts w:ascii="Arial" w:hAnsi="Arial" w:cs="Arial"/>
@@ -1679,19 +1801,8 @@
           <w:sz w:val="24"/>
           <w:szCs w:val="24"/>
         </w:rPr>
-        <w:t>VICTOR HUGO GEROTO TOLEDO</w:t>
-      </w:r>
-    </w:p>
-    <w:p>
-      <w:pPr>
-        <w:pStyle w:val="Textodenotadefim"/>
-        <w:rPr>
-          <w:rFonts w:ascii="Arial" w:hAnsi="Arial" w:cs="Arial"/>
-          <w:b/>
-          <w:sz w:val="24"/>
-          <w:szCs w:val="24"/>
-        </w:rPr>
-      </w:pPr>
+        <w:t>VICTOR HUGO GEROTO TOLEDO (Aluno)</w:t>
+      </w:r>
     </w:p>
     <w:tbl>
       <w:tblPr>
@@ -1737,11 +1848,43 @@
             </w:pPr>
             <w:r>
               <w:rPr>
-                <w:rFonts w:ascii="Arial" w:hAnsi="Arial" w:cs="Arial"/>
-                <w:sz w:val="24"/>
-                <w:szCs w:val="24"/>
+                <w:noProof/>
               </w:rPr>
-              <w:t>Foto</w:t>
+              <w:drawing>
+                <wp:inline distT="0" distB="0" distL="0" distR="0">
+                  <wp:extent cx="432000" cy="432000"/>
+                  <wp:effectExtent l="0" t="0" r="0" b="0"/>
+                  <wp:docPr id="1000" name="Foto do autor"/>
+                  <wp:cNvGraphicFramePr>
+                    <a:graphicFrameLocks xmlns:a="http://schemas.openxmlformats.org/drawingml/2006/main" noChangeAspect="1"/>
+                  </wp:cNvGraphicFramePr>
+                  <a:graphic xmlns:a="http://schemas.openxmlformats.org/drawingml/2006/main">
+                    <a:graphicData uri="http://schemas.openxmlformats.org/drawingml/2006/picture">
+                      <pic:pic xmlns:pic="http://schemas.openxmlformats.org/drawingml/2006/picture">
+                        <pic:nvPicPr>
+                          <pic:cNvPr id="0" name="foto-autor.jpeg"/>
+                          <pic:cNvPicPr/>
+                        </pic:nvPicPr>
+                        <pic:blipFill>
+                          <a:blip r:embed="rId11"/>
+                          <a:stretch>
+                            <a:fillRect/>
+                          </a:stretch>
+                        </pic:blipFill>
+                        <pic:spPr>
+                          <a:xfrm>
+                            <a:off x="0" y="0"/>
+                            <a:ext cx="432000" cy="432000"/>
+                          </a:xfrm>
+                          <a:prstGeom prst="rect">
+                            <a:avLst/>
+                          </a:prstGeom>
+                        </pic:spPr>
+                      </pic:pic>
+                    </a:graphicData>
+                  </a:graphic>
+                </wp:inline>
+              </w:drawing>
             </w:r>
           </w:p>
         </w:tc>
@@ -1764,7 +1907,7 @@
                 <w:sz w:val="24"/>
                 <w:szCs w:val="24"/>
               </w:rPr>
-              <w:t xml:space="preserve">Graduando em Análise e Desenvolvimento de Sistemas pelo Centro Universitário SENAI São Paulo — UNISENAI-SP, Campus Sorocaba. Desenvolve pesquisa de Iniciação Científica sobre padrões </w:t>
+              <w:t xml:space="preserve">Graduando em Análise e Desenvolvimento de Sistemas pelo Centro Universitário SENAI São Paulo — UNISENAI-SP, Campus Sorocaba, com formação técnica em Desenvolvimento de Sistemas pela mesma instituição. Atua como desenvolvedor full stack na T4E Group, com experiência em aplicações web construídas com Django, Spring Boot, Next.js e FastAPI, persistência em PostgreSQL e MongoDB e entrega contínua em nuvem. É bolsista de pesquisa e tecnologia do SESI/SENAI desde 2025, em estudo comparativo de linguagens, ecossistemas e arquiteturas de software, e possui certificação AWS Academy Graduate — Cloud Developing. Desenvolve pesquisa de Iniciação Científica sobre padrões arquiteturais de software (Monólito, Arquitetura em Camadas e Clean Architecture) aplicados a sistemas escaláveis, com foco em avaliação empírica de desempenho e manutenibilidade em ambiente de nuvem AWS.</w:t>
             </w:r>
             <w:r>
               <w:rPr>
@@ -1773,7 +1916,7 @@
                 <w:szCs w:val="24"/>
               </w:rPr>
               <w:lastRenderedPageBreak/>
-              <w:t>arquiteturais de software (Monólito, Arquitetura em Camadas e Clean Architecture) aplicados a sistemas escaláveis, com foco em avaliação empírica de desempenho e manutenibilidade em ambiente de nuvem AWS.</w:t>
+              <w:t xml:space="preserve"/>
             </w:r>
           </w:p>
         </w:tc>
@@ -1781,16 +1924,6 @@
     </w:tbl>
     <w:p>
       <w:pPr>
-        <w:pStyle w:val="Textodenotadefim"/>
-        <w:rPr>
-          <w:rFonts w:ascii="Arial" w:hAnsi="Arial" w:cs="Arial"/>
-          <w:sz w:val="24"/>
-          <w:szCs w:val="24"/>
-        </w:rPr>
-      </w:pPr>
-    </w:p>
-    <w:p>
-      <w:pPr>
         <w:rPr>
           <w:rFonts w:ascii="Arial" w:hAnsi="Arial" w:cs="Arial"/>
           <w:b/>
@@ -1841,7 +1974,7 @@
           <w:u w:val="single"/>
           <w:lang w:val="pt-BR"/>
         </w:rPr>
-        <w:t>DEIVISON TAKATU</w:t>
+        <w:t>DEIVISON SHINDI TAKATU (Orientador)</w:t>
       </w:r>
       <w:r>
         <w:rPr>
@@ -1854,16 +1987,6 @@
         </w:rPr>
         <w:t xml:space="preserve"/>
       </w:r>
-    </w:p>
-    <w:p>
-      <w:pPr>
-        <w:rPr>
-          <w:rFonts w:ascii="Arial" w:hAnsi="Arial" w:cs="Arial"/>
-          <w:sz w:val="24"/>
-          <w:szCs w:val="24"/>
-          <w:lang w:val="pt-BR"/>
-        </w:rPr>
-      </w:pPr>
     </w:p>
     <w:tbl>
       <w:tblPr>
@@ -1907,11 +2030,43 @@
             </w:pPr>
             <w:r>
               <w:rPr>
-                <w:rFonts w:ascii="Arial" w:hAnsi="Arial" w:cs="Arial"/>
-                <w:sz w:val="24"/>
-                <w:szCs w:val="24"/>
+                <w:noProof/>
               </w:rPr>
-              <w:t>Foto</w:t>
+              <w:drawing>
+                <wp:inline distT="0" distB="0" distL="0" distR="0">
+                  <wp:extent cx="432000" cy="427846"/>
+                  <wp:effectExtent l="0" t="0" r="0" b="0"/>
+                  <wp:docPr id="1002" name="Foto Deivison Shindi Takatu"/>
+                  <wp:cNvGraphicFramePr>
+                    <a:graphicFrameLocks xmlns:a="http://schemas.openxmlformats.org/drawingml/2006/main" noChangeAspect="1"/>
+                  </wp:cNvGraphicFramePr>
+                  <a:graphic xmlns:a="http://schemas.openxmlformats.org/drawingml/2006/main">
+                    <a:graphicData uri="http://schemas.openxmlformats.org/drawingml/2006/picture">
+                      <pic:pic xmlns:pic="http://schemas.openxmlformats.org/drawingml/2006/picture">
+                        <pic:nvPicPr>
+                          <pic:cNvPr id="0" name="Foto Deivison Shindi Takatu"/>
+                          <pic:cNvPicPr/>
+                        </pic:nvPicPr>
+                        <pic:blipFill>
+                          <a:blip r:embed="rId13"/>
+                          <a:stretch>
+                            <a:fillRect/>
+                          </a:stretch>
+                        </pic:blipFill>
+                        <pic:spPr>
+                          <a:xfrm>
+                            <a:off x="0" y="0"/>
+                            <a:ext cx="432000" cy="427846"/>
+                          </a:xfrm>
+                          <a:prstGeom prst="rect">
+                            <a:avLst/>
+                          </a:prstGeom>
+                        </pic:spPr>
+                      </pic:pic>
+                    </a:graphicData>
+                  </a:graphic>
+                </wp:inline>
+              </w:drawing>
             </w:r>
           </w:p>
         </w:tc>
@@ -1933,7 +2088,7 @@
                 <w:sz w:val="24"/>
                 <w:szCs w:val="24"/>
               </w:rPr>
-              <w:t>Professor do Centro Universitário SENAI São Paulo — UNISENAI-SP, Campus Sorocaba. Atua como orientador da pesquisa de Iniciação Científica que originou este trabalho, acompanhando a definição do tema, a construção do referencial teórico e a especificação experimental do protótipo.</w:t>
+              <w:t>Professor universitário, Mestre em Ciência da Computação pela Universidade Federal de São Carlos (UFSCar) Campus Sorocaba e Especialista em Informática Aplicada à Educação pelo IFSP Campus Itapetininga. Atua nas áreas de Ciência da Computação e Tecnologias Educacionais.</w:t>
             </w:r>
           </w:p>
         </w:tc>
@@ -1943,16 +2098,6 @@
       <w:pPr>
         <w:rPr>
           <w:rFonts w:ascii="Arial" w:hAnsi="Arial" w:cs="Arial"/>
-          <w:sz w:val="24"/>
-          <w:szCs w:val="24"/>
-          <w:lang w:val="pt-BR"/>
-        </w:rPr>
-      </w:pPr>
-    </w:p>
-    <w:p>
-      <w:pPr>
-        <w:rPr>
-          <w:rFonts w:ascii="Arial" w:hAnsi="Arial" w:cs="Arial"/>
           <w:b/>
           <w:sz w:val="24"/>
           <w:szCs w:val="24"/>
@@ -2001,18 +2146,8 @@
           <w:u w:val="single"/>
           <w:lang w:val="pt-BR"/>
         </w:rPr>
-        <w:t>GLAUCO TODESCO</w:t>
-      </w:r>
-    </w:p>
-    <w:p>
-      <w:pPr>
-        <w:rPr>
-          <w:rFonts w:ascii="Arial" w:hAnsi="Arial" w:cs="Arial"/>
-          <w:sz w:val="24"/>
-          <w:szCs w:val="24"/>
-          <w:lang w:val="pt-BR"/>
-        </w:rPr>
-      </w:pPr>
+        <w:t>GLAUCO TODESCO (Orientador)</w:t>
+      </w:r>
     </w:p>
     <w:tbl>
       <w:tblPr>
@@ -2056,11 +2191,43 @@
             </w:pPr>
             <w:r>
               <w:rPr>
-                <w:rFonts w:ascii="Arial" w:hAnsi="Arial" w:cs="Arial"/>
-                <w:sz w:val="24"/>
-                <w:szCs w:val="24"/>
+                <w:noProof/>
               </w:rPr>
-              <w:t>Foto</w:t>
+              <w:drawing>
+                <wp:inline distT="0" distB="0" distL="0" distR="0">
+                  <wp:extent cx="432000" cy="502615"/>
+                  <wp:effectExtent l="0" t="0" r="0" b="0"/>
+                  <wp:docPr id="1003" name="Foto Glauco Todesco"/>
+                  <wp:cNvGraphicFramePr>
+                    <a:graphicFrameLocks xmlns:a="http://schemas.openxmlformats.org/drawingml/2006/main" noChangeAspect="1"/>
+                  </wp:cNvGraphicFramePr>
+                  <a:graphic xmlns:a="http://schemas.openxmlformats.org/drawingml/2006/main">
+                    <a:graphicData uri="http://schemas.openxmlformats.org/drawingml/2006/picture">
+                      <pic:pic xmlns:pic="http://schemas.openxmlformats.org/drawingml/2006/picture">
+                        <pic:nvPicPr>
+                          <pic:cNvPr id="0" name="Foto Glauco Todesco"/>
+                          <pic:cNvPicPr/>
+                        </pic:nvPicPr>
+                        <pic:blipFill>
+                          <a:blip r:embed="rId14"/>
+                          <a:stretch>
+                            <a:fillRect/>
+                          </a:stretch>
+                        </pic:blipFill>
+                        <pic:spPr>
+                          <a:xfrm>
+                            <a:off x="0" y="0"/>
+                            <a:ext cx="432000" cy="502615"/>
+                          </a:xfrm>
+                          <a:prstGeom prst="rect">
+                            <a:avLst/>
+                          </a:prstGeom>
+                        </pic:spPr>
+                      </pic:pic>
+                    </a:graphicData>
+                  </a:graphic>
+                </wp:inline>
+              </w:drawing>
             </w:r>
           </w:p>
         </w:tc>
@@ -2082,7 +2249,7 @@
                 <w:sz w:val="24"/>
                 <w:szCs w:val="24"/>
               </w:rPr>
-              <w:t>Professor do Centro Universitário SENAI São Paulo — UNISENAI-SP, Campus Sorocaba. Atua como orientador da pesquisa de Iniciação Científica que originou este trabalho, contribuindo com a orientação metodológica e a revisão científica do texto.</w:t>
+              <w:t>Doutor em Engenharia Elétrica pela Universidade de São Paulo (2006) e Mestre em Ciência da Computação pela Universidade Federal de São Carlos (2000). Professor de graduação em cursos de computação em Sorocaba e Itu, CEO e pesquisador da Abútua Tecnologia.</w:t>
             </w:r>
           </w:p>
         </w:tc>

</xml_diff>